<commit_message>
Atualização T1 e T3
corrigidos os problemas indicados (tarefa mal implementada)
</commit_message>
<xml_diff>
--- a/Versão 1.2 -TG2_13_26889_27223_27224.docx
+++ b/Versão 1.2 -TG2_13_26889_27223_27224.docx
@@ -9625,10 +9625,7 @@
         <w:t>Utilizador:</w:t>
       </w:r>
       <w:r>
-        <w:t xml:space="preserve"> p</w:t>
-      </w:r>
-      <w:r>
-        <w:t>arteira</w:t>
+        <w:t xml:space="preserve"> parteira</w:t>
       </w:r>
     </w:p>
     <w:p>
@@ -9640,13 +9637,7 @@
         <w:t>Tarefa:</w:t>
       </w:r>
       <w:r>
-        <w:t xml:space="preserve"> </w:t>
-      </w:r>
-      <w:r>
-        <w:t>r</w:t>
-      </w:r>
-      <w:r>
-        <w:t xml:space="preserve">ealizar uma avaliação </w:t>
+        <w:t xml:space="preserve"> realizar uma avaliação </w:t>
       </w:r>
       <w:proofErr w:type="spellStart"/>
       <w:r>
@@ -9682,10 +9673,7 @@
         <w:t>:</w:t>
       </w:r>
       <w:r>
-        <w:t xml:space="preserve"> o</w:t>
-      </w:r>
-      <w:r>
-        <w:t xml:space="preserve"> utilizador entra na área de avaliação, seleciona as opções correspondentes à cor, frequência cardíaca, resposta a estímulos, tónus muscular e respiração, e consulta a pontuação calculada pela aplicação.</w:t>
+        <w:t xml:space="preserve"> o utilizador entra na área de avaliação, seleciona as opções correspondentes à cor, frequência cardíaca, resposta a estímulos, tónus muscular e respiração, e consulta a pontuação calculada pela aplicação.</w:t>
       </w:r>
     </w:p>
     <w:p>
@@ -9757,10 +9745,7 @@
         </w:numPr>
       </w:pPr>
       <w:r>
-        <w:t>Selecion</w:t>
-      </w:r>
-      <w:r>
-        <w:t>ar a cor da pele.</w:t>
+        <w:t>Selecionar a cor da pele.</w:t>
       </w:r>
     </w:p>
     <w:p>
@@ -9796,10 +9781,7 @@
         </w:numPr>
       </w:pPr>
       <w:r>
-        <w:t>S</w:t>
-      </w:r>
-      <w:r>
-        <w:t>elecionar o tónus muscular.</w:t>
+        <w:t>Selecionar o tónus muscular.</w:t>
       </w:r>
     </w:p>
     <w:p>
@@ -9825,37 +9807,14 @@
       <w:r>
         <w:t>Confirmar os dados introduzidos.</w:t>
       </w:r>
+      <w:r>
+        <w:t xml:space="preserve"> </w:t>
+      </w:r>
     </w:p>
     <w:p>
       <w:pPr>
         <w:pStyle w:val="PargrafodaLista"/>
-        <w:numPr>
-          <w:ilvl w:val="0"/>
-          <w:numId w:val="36"/>
-        </w:numPr>
-      </w:pPr>
-      <w:r>
-        <w:t>Visualizar a pontuação final.</w:t>
-      </w:r>
-    </w:p>
-    <w:p>
-      <w:pPr>
-        <w:pStyle w:val="PargrafodaLista"/>
-        <w:numPr>
-          <w:ilvl w:val="0"/>
-          <w:numId w:val="36"/>
-        </w:numPr>
-      </w:pPr>
-      <w:r>
-        <w:t>I</w:t>
-      </w:r>
-      <w:r>
-        <w:t>dentificar a categoria do resultado.</w:t>
-      </w:r>
-    </w:p>
-    <w:p>
-      <w:pPr>
-        <w:ind w:firstLine="0"/>
+        <w:ind w:left="360" w:firstLine="0"/>
       </w:pPr>
     </w:p>
     <w:p>
@@ -9870,7 +9829,10 @@
         <w:t>Plano de execução:</w:t>
       </w:r>
       <w:r>
-        <w:t xml:space="preserve"> Tarefas 1-6 em ordem. Dentro da 3, executar todas as </w:t>
+        <w:t xml:space="preserve"> Tarefas 1-4</w:t>
+      </w:r>
+      <w:r>
+        <w:t xml:space="preserve"> em ordem. Dentro da 3, executar todas as </w:t>
       </w:r>
       <w:proofErr w:type="spellStart"/>
       <w:r>
@@ -10461,23 +10423,7 @@
           <w:sz w:val="24"/>
           <w:szCs w:val="24"/>
         </w:rPr>
-        <w:t>–</w:t>
-      </w:r>
-      <w:r>
-        <w:rPr>
-          <w:color w:val="000000" w:themeColor="text1"/>
-          <w:sz w:val="24"/>
-          <w:szCs w:val="24"/>
-        </w:rPr>
-        <w:t xml:space="preserve"> </w:t>
-      </w:r>
-      <w:r>
-        <w:rPr>
-          <w:color w:val="000000" w:themeColor="text1"/>
-          <w:sz w:val="24"/>
-          <w:szCs w:val="24"/>
-        </w:rPr>
-        <w:t>Diagrama desenvolvido inicialmente para a realização de uma avaliação</w:t>
+        <w:t>– Diagrama desenvolvido inicialmente para a realização de uma avaliação</w:t>
       </w:r>
     </w:p>
     <w:p>
@@ -12849,12 +12795,10 @@
     </w:p>
     <w:p>
       <w:r>
-        <w:t>A tarefa 1 permanece semelhante ao conceito original: a utilização da calculadora para determinar um resultado final, que irá influenciar as decisões da pessoa que utiliza a aplicação.</w:t>
-      </w:r>
-    </w:p>
-    <w:p>
-      <w:r>
-        <w:t>O código desenvolvido permite não só inserir dados e observar o resultado, como submeter essa avaliação, que ficará guardada da base de dados fictícia desenvolvida posteriormente na tarefa 3.</w:t>
+        <w:t>A tarefa 1 permanece semelhante ao con</w:t>
+      </w:r>
+      <w:r>
+        <w:t>ceito original: a utilização dos botões da calculadora para inserir os dados observados.</w:t>
       </w:r>
     </w:p>
     <w:p>
@@ -12900,17 +12844,6 @@
         <w:t>valores</w:t>
       </w:r>
       <w:r>
-        <w:t xml:space="preserve"> e efetuar o cálculo da soma em </w:t>
-      </w:r>
-      <w:r>
-        <w:rPr>
-          <w:rFonts w:ascii="Consolas" w:hAnsi="Consolas"/>
-          <w:sz w:val="21"/>
-          <w:szCs w:val="21"/>
-        </w:rPr>
-        <w:t>resultado</w:t>
-      </w:r>
-      <w:r>
         <w:t>.</w:t>
       </w:r>
     </w:p>
@@ -12923,42 +12856,6 @@
         </w:numPr>
       </w:pPr>
       <w:r>
-        <w:t>Possibilidade de submeter a avaliação preenchida, adicionando-a à “base de dados” mencionada anteriormente, com número e nome</w:t>
-      </w:r>
-      <w:r>
-        <w:t xml:space="preserve"> de utente</w:t>
-      </w:r>
-      <w:r>
-        <w:t xml:space="preserve"> </w:t>
-      </w:r>
-      <w:proofErr w:type="spellStart"/>
-      <w:r>
-        <w:rPr>
-          <w:i/>
-          <w:iCs/>
-        </w:rPr>
-        <w:t>placeholders</w:t>
-      </w:r>
-      <w:proofErr w:type="spellEnd"/>
-      <w:r>
-        <w:t xml:space="preserve">. Isto permitirá </w:t>
-      </w:r>
-      <w:r>
-        <w:t>com que as avaliações sejam adicionadas à aba da análise dos utentes</w:t>
-      </w:r>
-      <w:r>
-        <w:t>.</w:t>
-      </w:r>
-    </w:p>
-    <w:p>
-      <w:pPr>
-        <w:pStyle w:val="PargrafodaLista"/>
-        <w:numPr>
-          <w:ilvl w:val="0"/>
-          <w:numId w:val="37"/>
-        </w:numPr>
-      </w:pPr>
-      <w:r>
         <w:t>Condições de uso: botões selecionados ficam azuis com texto branco</w:t>
       </w:r>
       <w:r>
@@ -12968,43 +12865,35 @@
         <w:t>uando as 5 propriedades estão preenchidas acima</w:t>
       </w:r>
       <w:r>
-        <w:t>, o botão de submeter fica ativo e o</w:t>
-      </w:r>
-      <w:r>
-        <w:t xml:space="preserve"> texto</w:t>
-      </w:r>
-      <w:r>
-        <w:t xml:space="preserve"> do resultado </w:t>
-      </w:r>
-      <w:r>
-        <w:t>mostra a cor</w:t>
-      </w:r>
-      <w:r>
-        <w:t xml:space="preserve"> correspondente ao estado (crítico, moderado ou bom). Caso contrário, o botão é desativado e o texto fica a cinza claro</w:t>
-      </w:r>
+        <w:t xml:space="preserve">, o botão de submeter fica ativo. Caso contrário, o botão é </w:t>
+      </w:r>
+      <w:r>
+        <w:t>desativado.</w:t>
+      </w:r>
+    </w:p>
+    <w:p/>
+    <w:p>
+      <w:r>
+        <w:t>(falta imagens do código e/ou da aplicação)</w:t>
+      </w:r>
+    </w:p>
+    <w:p/>
+    <w:p/>
+    <w:p>
+      <w:pPr>
+        <w:ind w:firstLine="0"/>
+      </w:pPr>
+    </w:p>
+    <w:p>
+      <w:pPr>
+        <w:ind w:firstLine="0"/>
+      </w:pPr>
+    </w:p>
+    <w:p/>
+    <w:p/>
+    <w:p>
       <w:bookmarkStart w:id="56" w:name="_GoBack"/>
       <w:bookmarkEnd w:id="56"/>
-      <w:r>
-        <w:t>.</w:t>
-      </w:r>
-    </w:p>
-    <w:p/>
-    <w:p>
-      <w:r>
-        <w:t>(falta imagens do código e/ou da aplicação)</w:t>
-      </w:r>
-    </w:p>
-    <w:p/>
-    <w:p/>
-    <w:p>
-      <w:pPr>
-        <w:ind w:firstLine="0"/>
-      </w:pPr>
-    </w:p>
-    <w:p>
-      <w:pPr>
-        <w:ind w:firstLine="0"/>
-      </w:pPr>
     </w:p>
     <w:p/>
     <w:p>
@@ -13912,7 +13801,7 @@
           <w:rPr>
             <w:noProof/>
           </w:rPr>
-          <w:t>37</w:t>
+          <w:t>38</w:t>
         </w:r>
         <w:r>
           <w:fldChar w:fldCharType="end"/>
@@ -20058,7 +19947,7 @@
 </file>
 
 <file path=customXml/itemProps1.xml><?xml version="1.0" encoding="utf-8"?>
-<ds:datastoreItem xmlns:ds="http://schemas.openxmlformats.org/officeDocument/2006/customXml" ds:itemID="{B4F1BC85-2B6D-4DC3-A46E-CD5B1BACE771}">
+<ds:datastoreItem xmlns:ds="http://schemas.openxmlformats.org/officeDocument/2006/customXml" ds:itemID="{EDD50391-D5C1-4041-8985-BC9F812C06CE}">
   <ds:schemaRefs>
     <ds:schemaRef ds:uri="http://schemas.openxmlformats.org/officeDocument/2006/bibliography"/>
   </ds:schemaRefs>

</xml_diff>